<commit_message>
Idea parcial para empezar, a programar, despues del analisis.
</commit_message>
<xml_diff>
--- a/Informe.docx
+++ b/Informe.docx
@@ -118,7 +118,15 @@
         <w:t xml:space="preserve">Por el momento tengo esta lista de clases con sus métodos y atributos. </w:t>
       </w:r>
       <w:r>
-        <w:t xml:space="preserve">A continuación en el diagrama tengo </w:t>
+        <w:t xml:space="preserve">A </w:t>
+      </w:r>
+      <w:proofErr w:type="gramStart"/>
+      <w:r>
+        <w:t>continuación</w:t>
+      </w:r>
+      <w:proofErr w:type="gramEnd"/>
+      <w:r>
+        <w:t xml:space="preserve"> en el diagrama tengo </w:t>
       </w:r>
       <w:r>
         <w:t>las</w:t>
@@ -151,30 +159,65 @@
       <w:r>
         <w:t xml:space="preserve"> y puede tener acceso a fotos, álbum, amigos, fotos de los amigos </w:t>
       </w:r>
+      <w:r>
+        <w:t>públicas</w:t>
+      </w:r>
+      <w:r>
+        <w:t xml:space="preserve">. </w:t>
+      </w:r>
+    </w:p>
+    <w:p>
+      <w:pPr>
+        <w:jc w:val="both"/>
+      </w:pPr>
+      <w:r>
+        <w:t xml:space="preserve">Primer se debe cargar los usuarios, pienso crear un archivo que contiene el usuario y el </w:t>
+      </w:r>
       <w:proofErr w:type="spellStart"/>
       <w:r>
-        <w:t>publicas</w:t>
+        <w:t>password</w:t>
       </w:r>
       <w:proofErr w:type="spellEnd"/>
       <w:r>
-        <w:t xml:space="preserve">. </w:t>
-      </w:r>
-      <w:r>
-        <w:br/>
-      </w:r>
+        <w:t>, cuando se accede debe de buscar</w:t>
+      </w:r>
+      <w:r>
+        <w:t>. Los usuarios los guardare con un numero un índice que va ocupar menos espacio</w:t>
+      </w:r>
+      <w:r>
+        <w:t xml:space="preserve">, las amistades después de consultar se a realizar en una matriz de adyacencia. La forma que encontré de utilizar las plantillas con el arreglo </w:t>
+      </w:r>
+      <w:proofErr w:type="spellStart"/>
+      <w:r>
+        <w:t>dinamico</w:t>
+      </w:r>
+      <w:proofErr w:type="spellEnd"/>
+      <w:r>
+        <w:t xml:space="preserve">, voy a implementar el código que utilice para realizar el laboratorio 3, específicamente cuando comprimo en el algoritmo LZ78. </w:t>
+      </w:r>
+    </w:p>
+    <w:p>
+      <w:pPr>
+        <w:jc w:val="both"/>
+      </w:pPr>
+    </w:p>
+    <w:p>
+      <w:pPr>
+        <w:jc w:val="both"/>
+      </w:pPr>
       <w:r>
         <w:lastRenderedPageBreak/>
         <w:br/>
       </w:r>
       <w:r>
-        <w:rPr>
-          <w:noProof/>
-        </w:rPr>
+        <w:br/>
+      </w:r>
+      <w:r>
         <w:drawing>
-          <wp:inline distT="0" distB="0" distL="0" distR="0" wp14:anchorId="27E49119" wp14:editId="6BBFFDB5">
-            <wp:extent cx="5612130" cy="5612130"/>
-            <wp:effectExtent l="0" t="0" r="7620" b="7620"/>
-            <wp:docPr id="306352693" name="Imagen 1"/>
+          <wp:inline distT="0" distB="0" distL="0" distR="0" wp14:anchorId="36CD9B02" wp14:editId="264CC9B3">
+            <wp:extent cx="5612130" cy="6282055"/>
+            <wp:effectExtent l="0" t="0" r="7620" b="4445"/>
+            <wp:docPr id="1" name="Imagen 1"/>
             <wp:cNvGraphicFramePr>
               <a:graphicFrameLocks xmlns:a="http://schemas.openxmlformats.org/drawingml/2006/main" noChangeAspect="1"/>
             </wp:cNvGraphicFramePr>
@@ -182,7 +225,7 @@
               <a:graphicData uri="http://schemas.openxmlformats.org/drawingml/2006/picture">
                 <pic:pic xmlns:pic="http://schemas.openxmlformats.org/drawingml/2006/picture">
                   <pic:nvPicPr>
-                    <pic:cNvPr id="306352693" name=""/>
+                    <pic:cNvPr id="1" name=""/>
                     <pic:cNvPicPr/>
                   </pic:nvPicPr>
                   <pic:blipFill>
@@ -194,7 +237,7 @@
                   <pic:spPr>
                     <a:xfrm>
                       <a:off x="0" y="0"/>
-                      <a:ext cx="5612130" cy="5612130"/>
+                      <a:ext cx="5612130" cy="6282055"/>
                     </a:xfrm>
                     <a:prstGeom prst="rect">
                       <a:avLst/>

</xml_diff>